<commit_message>
docs: Length of Stay computation logic, revision 4 (DOPR included)
</commit_message>
<xml_diff>
--- a/docs/Emollient_LengthOfStay_Computation_v2.docx
+++ b/docs/Emollient_LengthOfStay_Computation_v2.docx
@@ -64,7 +64,7 @@
           <w:sz w:val="20"/>
           <w:szCs w:val="20"/>
         </w:rPr>
-        <w:t xml:space="preserve">Aggregator version 2 • Document revision 3 • September 2026</w:t>
+        <w:t xml:space="preserve">Aggregator version 2 • Document revision 4 • September 2026</w:t>
       </w:r>
     </w:p>
     <w:p>
@@ -119,7 +119,7 @@
         <w:spacing w:after="160"/>
       </w:pPr>
       <w:r>
-        <w:t xml:space="preserve">Length of Stay (LOS) is computed for every enrolled baby who had a planned discharge, as the number of completed days between hospital admission and the actual discharge. Every other enrolled baby is still counted: each is assigned exactly one outcome that explains why no LOS was computed, so the report can always be reconciled back to the number enrolled.</w:t>
+        <w:t xml:space="preserve">Length of Stay (LOS) is computed for every enrolled baby discharged as planned (TYP_FP), Other (TYP_OTH) or on parental request (TYP_DOPR), as the number of completed days between hospital admission and the actual discharge. Every other enrolled baby is still counted: each is assigned exactly one outcome that explains why no LOS was computed, so the report can always be reconciled back to the number enrolled.</w:t>
       </w:r>
     </w:p>
     <w:p>
@@ -146,6 +146,26 @@
       <w:pPr>
         <w:spacing w:after="120"/>
       </w:pPr>
+    </w:p>
+    <w:p>
+      <w:pPr>
+        <w:pBdr>
+          <w:left w:val="single" w:color="2563EB" w:sz="18" w:space="8"/>
+        </w:pBdr>
+        <w:spacing w:after="200" w:before="120"/>
+        <w:ind w:left="360"/>
+      </w:pPr>
+      <w:r>
+        <w:rPr>
+          <w:b/>
+          <w:bCs/>
+          <w:color w:val="2563EB"/>
+        </w:rPr>
+        <w:t xml:space="preserve">Definition change, 22 September 2026: </w:t>
+      </w:r>
+      <w:r>
+        <w:t xml:space="preserve">DOPR discharges were excluded until this date and now produce an LOS. Figures produced before the change are not comparable with those after it: they count fewer babies, and probably a longer mean, since a stay ended at the parents' request is likely to be shorter than a planned one.</w:t>
+      </w:r>
     </w:p>
     <w:p>
       <w:pPr>
@@ -1985,7 +2005,7 @@
                 <w:sz w:val="20"/>
                 <w:szCs w:val="20"/>
               </w:rPr>
-              <w:t xml:space="preserve">Death, LAMA, Abscond, DOPR, Referral</w:t>
+              <w:t xml:space="preserve">Death, LAMA, Abscond, Referral</w:t>
             </w:r>
           </w:p>
         </w:tc>
@@ -2097,7 +2117,7 @@
                 <w:sz w:val="20"/>
                 <w:szCs w:val="20"/>
               </w:rPr>
-              <w:t xml:space="preserve">Planned discharge with valid admission and discharge datetimes</w:t>
+              <w:t xml:space="preserve">Discharge type TYP_FP, TYP_OTH or TYP_DOPR, with valid admission and discharge datetimes</w:t>
             </w:r>
           </w:p>
         </w:tc>
@@ -2788,7 +2808,7 @@
                 <w:sz w:val="20"/>
                 <w:szCs w:val="20"/>
               </w:rPr>
-              <w:t xml:space="preserve">Discharge type is TYP_DEA, TYP_LAMA, TYP_ABS, TYP_DOPR or TYP_REF</w:t>
+              <w:t xml:space="preserve">Discharge type is TYP_DEA, TYP_LAMA, TYP_ABS or TYP_REF</w:t>
             </w:r>
           </w:p>
         </w:tc>
@@ -2809,7 +2829,7 @@
                 <w:sz w:val="20"/>
                 <w:szCs w:val="20"/>
               </w:rPr>
-              <w:t xml:space="preserve">Death, LAMA, Abscond, DOPR or Referral</w:t>
+              <w:t xml:space="preserve">Death, LAMA, Abscond or Referral</w:t>
             </w:r>
           </w:p>
         </w:tc>
@@ -2855,7 +2875,7 @@
                 <w:sz w:val="20"/>
                 <w:szCs w:val="20"/>
               </w:rPr>
-              <w:t xml:space="preserve">Discharge type is anything other than TYP_FP or TYP_OTH</w:t>
+              <w:t xml:space="preserve">Discharge type is anything other than TYP_FP, TYP_OTH or TYP_DOPR</w:t>
             </w:r>
           </w:p>
         </w:tc>
@@ -4080,7 +4100,7 @@
                 <w:sz w:val="20"/>
                 <w:szCs w:val="20"/>
               </w:rPr>
-              <w:t xml:space="preserve">DOPR</w:t>
+              <w:t xml:space="preserve">Discharge on parental request</w:t>
             </w:r>
           </w:p>
         </w:tc>
@@ -4102,7 +4122,7 @@
                 <w:sz w:val="20"/>
                 <w:szCs w:val="20"/>
               </w:rPr>
-              <w:t xml:space="preserve">Excluded</w:t>
+              <w:t xml:space="preserve">LOS computed, and counted separately — see §7.1</w:t>
             </w:r>
           </w:p>
         </w:tc>
@@ -6209,6 +6229,50 @@
           </w:p>
         </w:tc>
       </w:tr>
+      <w:tr>
+        <w:tc>
+          <w:tcPr>
+            <w:tcW w:type="pct" w:w="16%"/>
+            <w:tcMar>
+              <w:top w:type="dxa" w:w="70"/>
+              <w:left w:type="dxa" w:w="100"/>
+              <w:bottom w:type="dxa" w:w="70"/>
+              <w:right w:type="dxa" w:w="100"/>
+            </w:tcMar>
+            <w:vAlign w:val="center"/>
+          </w:tcPr>
+          <w:p>
+            <w:r>
+              <w:rPr>
+                <w:sz w:val="20"/>
+                <w:szCs w:val="20"/>
+              </w:rPr>
+              <w:t xml:space="preserve">DOPR</w:t>
+            </w:r>
+          </w:p>
+        </w:tc>
+        <w:tc>
+          <w:tcPr>
+            <w:tcW w:type="pct" w:w="84%"/>
+            <w:tcMar>
+              <w:top w:type="dxa" w:w="70"/>
+              <w:left w:type="dxa" w:w="100"/>
+              <w:bottom w:type="dxa" w:w="70"/>
+              <w:right w:type="dxa" w:w="100"/>
+            </w:tcMar>
+            <w:vAlign w:val="center"/>
+          </w:tcPr>
+          <w:p>
+            <w:r>
+              <w:rPr>
+                <w:sz w:val="20"/>
+                <w:szCs w:val="20"/>
+              </w:rPr>
+              <w:t xml:space="preserve">How many of the n had discharge type TYP_DOPR</w:t>
+            </w:r>
+          </w:p>
+        </w:tc>
+      </w:tr>
     </w:tbl>
     <w:p>
       <w:pPr>
@@ -6216,7 +6280,7 @@
         <w:spacing w:after="160" w:before="360"/>
       </w:pPr>
       <w:r>
-        <w:t xml:space="preserve">7.1 Why 'Other' is shown</w:t>
+        <w:t xml:space="preserve">7.1 Why Other and DOPR are shown separately</w:t>
       </w:r>
     </w:p>
     <w:p>
@@ -6225,6 +6289,14 @@
       </w:pPr>
       <w:r>
         <w:t xml:space="preserve">TYP_OTH is included, but it can mean anything. Showing the count lets someone see if a site's LOS figures rest heavily on discharges nobody has categorised — which would be worth looking into.</w:t>
+      </w:r>
+    </w:p>
+    <w:p>
+      <w:pPr>
+        <w:spacing w:after="160"/>
+      </w:pPr>
+      <w:r>
+        <w:t xml:space="preserve">TYP_DOPR is included, but a stay ended at the parents' request is likely to be shorter than a planned one. A site with many DOPR discharges will show a lower mean for that reason alone, and the count makes that visible.</w:t>
       </w:r>
     </w:p>
     <w:p>
@@ -7280,7 +7352,7 @@
                 <w:sz w:val="20"/>
                 <w:szCs w:val="20"/>
               </w:rPr>
-              <w:t xml:space="preserve">For a data issue, the specific reason; for TYP_OTH, a note</w:t>
+              <w:t xml:space="preserve">For a data issue, the specific reason; for TYP_OTH or TYP_DOPR, a note</w:t>
             </w:r>
           </w:p>
         </w:tc>

</xml_diff>